<commit_message>
fix: 合同字体统一 + 恢复Anlage B数据行({packaging_rows})
- 字体统一: 副标题/Anlage表 sz18→21, Unterzeichnung标题 sz28→30
- 修复: 恢复上一轮被误删的Anlage B数据单元格{packaging_rows}，并规范为单行8格(4表头+4数据)

Co-Authored-By: Claude <noreply@anthropic.com>
</commit_message>
<xml_diff>
--- a/projects/contracts/LIVANTO/包装法_授权代表合同.docx
+++ b/projects/contracts/LIVANTO/包装法_授权代表合同.docx
@@ -43,8 +43,8 @@
           <w:rFonts w:ascii="Times New Roman" w:hAnsi="Times New Roman" w:eastAsia="Times New Roman" w:cs="Times New Roman"/>
           <w:b w:val="0"/>
           <w:bCs w:val="0"/>
-          <w:sz w:val="18"/>
-          <w:szCs w:val="18"/>
+          <w:sz w:val="21"/>
+          <w:szCs w:val="21"/>
         </w:rPr>
         <w:t>gemäß § 35 Absatz 2 Verpackungsgesetz (VerpackG) / PPWR (EU) 2025/40</w:t>
       </w:r>
@@ -59,8 +59,8 @@
           <w:rFonts w:ascii="宋体" w:hAnsi="宋体" w:eastAsia="宋体" w:cs="宋体"/>
           <w:b w:val="0"/>
           <w:bCs w:val="0"/>
-          <w:sz w:val="18"/>
-          <w:szCs w:val="18"/>
+          <w:sz w:val="21"/>
+          <w:szCs w:val="21"/>
         </w:rPr>
         <w:t>依据《德国包装法》§35条第2款 / 欧盟PPWR 2025/40</w:t>
       </w:r>
@@ -9558,8 +9558,8 @@
                 <w:b/>
                 <w:bCs/>
                 <w:color w:val="FFFFFF"/>
-                <w:sz w:val="18"/>
-                <w:szCs w:val="18"/>
+                <w:sz w:val="21"/>
+                <w:szCs w:val="21"/>
               </w:rPr>
               <w:t>Materialfraktion / 材料类别</w:t>
             </w:r>
@@ -9586,8 +9586,8 @@
                 <w:b/>
                 <w:bCs/>
                 <w:color w:val="FFFFFF"/>
-                <w:sz w:val="18"/>
-                <w:szCs w:val="18"/>
+                <w:sz w:val="21"/>
+                <w:szCs w:val="21"/>
               </w:rPr>
               <w:t>Kategorie / 类别</w:t>
             </w:r>
@@ -9614,8 +9614,8 @@
                 <w:b/>
                 <w:bCs/>
                 <w:color w:val="FFFFFF"/>
-                <w:sz w:val="18"/>
-                <w:szCs w:val="18"/>
+                <w:sz w:val="21"/>
+                <w:szCs w:val="21"/>
               </w:rPr>
               <w:t>Geschätzte Menge (kg/Jahr) / 预估年量(公斤)</w:t>
             </w:r>
@@ -9642,12 +9642,69 @@
                 <w:b/>
                 <w:bCs/>
                 <w:color w:val="FFFFFF"/>
-                <w:sz w:val="18"/>
-                <w:szCs w:val="18"/>
+                <w:sz w:val="21"/>
+                <w:szCs w:val="21"/>
               </w:rPr>
               <w:t>Produktbeispiel / 产品举例</w:t>
             </w:r>
           </w:p>
+        </w:tc>
+        <w:tc>
+          <w:tcPr>
+            <w:tcW w:w="2600" w:type="dxa"/>
+            <w:tcMar>
+              <w:top w:w="30" w:type="dxa"/>
+              <w:left w:w="50" w:type="dxa"/>
+              <w:bottom w:w="30" w:type="dxa"/>
+              <w:right w:w="50" w:type="dxa"/>
+            </w:tcMar>
+          </w:tcPr>
+          <w:p>
+            <w:r>
+              <w:rPr>
+                <w:rFonts w:ascii="Times New Roman" w:hAnsi="Times New Roman" w:eastAsia="Times New Roman" w:cs="Times New Roman"/>
+                <w:sz w:val="21"/>
+                <w:szCs w:val="21"/>
+              </w:rPr>
+              <w:t xml:space="preserve">{packaging_rows}</w:t>
+            </w:r>
+          </w:p>
+        </w:tc>
+        <w:tc>
+          <w:tcPr>
+            <w:tcW w:w="1000" w:type="dxa"/>
+            <w:tcMar>
+              <w:top w:w="30" w:type="dxa"/>
+              <w:left w:w="50" w:type="dxa"/>
+              <w:bottom w:w="30" w:type="dxa"/>
+              <w:right w:w="50" w:type="dxa"/>
+            </w:tcMar>
+          </w:tcPr>
+          <w:p/>
+        </w:tc>
+        <w:tc>
+          <w:tcPr>
+            <w:tcW w:w="2200" w:type="dxa"/>
+            <w:tcMar>
+              <w:top w:w="30" w:type="dxa"/>
+              <w:left w:w="50" w:type="dxa"/>
+              <w:bottom w:w="30" w:type="dxa"/>
+              <w:right w:w="50" w:type="dxa"/>
+            </w:tcMar>
+          </w:tcPr>
+          <w:p/>
+        </w:tc>
+        <w:tc>
+          <w:tcPr>
+            <w:tcW w:w="3955" w:type="dxa"/>
+            <w:tcMar>
+              <w:top w:w="30" w:type="dxa"/>
+              <w:left w:w="50" w:type="dxa"/>
+              <w:bottom w:w="30" w:type="dxa"/>
+              <w:right w:w="50" w:type="dxa"/>
+            </w:tcMar>
+          </w:tcPr>
+          <w:p/>
         </w:tc>
       </w:tr>
     </w:tbl>
@@ -9988,8 +10045,8 @@
                 <w:b/>
                 <w:bCs/>
                 <w:color w:val="FFFFFF"/>
-                <w:sz w:val="18"/>
-                <w:szCs w:val="18"/>
+                <w:sz w:val="21"/>
+                <w:szCs w:val="21"/>
               </w:rPr>
               <w:t>Servicestufe / 服务等级</w:t>
             </w:r>
@@ -10016,8 +10073,8 @@
                 <w:b/>
                 <w:bCs/>
                 <w:color w:val="FFFFFF"/>
-                <w:sz w:val="18"/>
-                <w:szCs w:val="18"/>
+                <w:sz w:val="21"/>
+                <w:szCs w:val="21"/>
               </w:rPr>
               <w:t>Jahresgrundgebühr / 年度基本费</w:t>
             </w:r>
@@ -10044,8 +10101,8 @@
                 <w:b/>
                 <w:bCs/>
                 <w:color w:val="FFFFFF"/>
-                <w:sz w:val="18"/>
-                <w:szCs w:val="18"/>
+                <w:sz w:val="21"/>
+                <w:szCs w:val="21"/>
               </w:rPr>
               <w:t>Leistungsumfang / 服务范围</w:t>
             </w:r>
@@ -10085,8 +10142,8 @@
                 <w:rFonts w:ascii="Times New Roman" w:hAnsi="Times New Roman" w:eastAsia="Times New Roman" w:cs="Times New Roman"/>
                 <w:b/>
                 <w:bCs/>
-                <w:sz w:val="18"/>
-                <w:szCs w:val="18"/>
+                <w:sz w:val="21"/>
+                <w:szCs w:val="21"/>
               </w:rPr>
               <w:t>Basis / 基础</w:t>
             </w:r>
@@ -10108,8 +10165,8 @@
                 <w:rFonts w:ascii="Times New Roman" w:hAnsi="Times New Roman" w:eastAsia="Times New Roman" w:cs="Times New Roman"/>
                 <w:b w:val="0"/>
                 <w:bCs w:val="0"/>
-                <w:sz w:val="18"/>
-                <w:szCs w:val="18"/>
+                <w:sz w:val="21"/>
+                <w:szCs w:val="21"/>
               </w:rPr>
               <w:t>EUR 29,00</w:t>
             </w:r>
@@ -10131,8 +10188,8 @@
                 <w:rFonts w:ascii="Times New Roman" w:hAnsi="Times New Roman" w:eastAsia="Times New Roman" w:cs="Times New Roman"/>
                 <w:b w:val="0"/>
                 <w:bCs w:val="0"/>
-                <w:sz w:val="18"/>
-                <w:szCs w:val="18"/>
+                <w:sz w:val="21"/>
+                <w:szCs w:val="21"/>
               </w:rPr>
               <w:t>Kern-AR-Dienstleistungen: Systembeteiligung, LUCID-Datenmeldung, Behördenkorrespondenz, gesetzliche Informationspflichten / 核心AR服务：系统参与、LUCID数据申报、官方通信、法定信息义务</w:t>
             </w:r>
@@ -10173,8 +10230,8 @@
                 <w:rFonts w:ascii="Times New Roman" w:hAnsi="Times New Roman" w:eastAsia="Times New Roman" w:cs="Times New Roman"/>
                 <w:b/>
                 <w:bCs/>
-                <w:sz w:val="18"/>
-                <w:szCs w:val="18"/>
+                <w:sz w:val="21"/>
+                <w:szCs w:val="21"/>
               </w:rPr>
               <w:t>Standard / 标准</w:t>
             </w:r>
@@ -10197,8 +10254,8 @@
                 <w:rFonts w:ascii="Times New Roman" w:hAnsi="Times New Roman" w:eastAsia="Times New Roman" w:cs="Times New Roman"/>
                 <w:b w:val="0"/>
                 <w:bCs w:val="0"/>
-                <w:sz w:val="18"/>
-                <w:szCs w:val="18"/>
+                <w:sz w:val="21"/>
+                <w:szCs w:val="21"/>
               </w:rPr>
               <w:t>EUR 49,00</w:t>
             </w:r>
@@ -10221,8 +10278,8 @@
                 <w:rFonts w:ascii="Times New Roman" w:hAnsi="Times New Roman" w:eastAsia="Times New Roman" w:cs="Times New Roman"/>
                 <w:b w:val="0"/>
                 <w:bCs w:val="0"/>
-                <w:sz w:val="18"/>
-                <w:szCs w:val="18"/>
+                <w:sz w:val="21"/>
+                <w:szCs w:val="21"/>
               </w:rPr>
               <w:t>Basis + prioritäre Reaktionszeit (48 h) + erweiterte Klassifizierungsberatung + jährlicher Compliance-Kurzbericht / 基础+优先响应时间(48小时)+扩展分类咨询+年度合规简报</w:t>
             </w:r>
@@ -10262,8 +10319,8 @@
                 <w:rFonts w:ascii="Times New Roman" w:hAnsi="Times New Roman" w:eastAsia="Times New Roman" w:cs="Times New Roman"/>
                 <w:b/>
                 <w:bCs/>
-                <w:sz w:val="18"/>
-                <w:szCs w:val="18"/>
+                <w:sz w:val="21"/>
+                <w:szCs w:val="21"/>
               </w:rPr>
               <w:t>Premium / 高级</w:t>
             </w:r>
@@ -10285,8 +10342,8 @@
                 <w:rFonts w:ascii="Times New Roman" w:hAnsi="Times New Roman" w:eastAsia="Times New Roman" w:cs="Times New Roman"/>
                 <w:b w:val="0"/>
                 <w:bCs w:val="0"/>
-                <w:sz w:val="18"/>
-                <w:szCs w:val="18"/>
+                <w:sz w:val="21"/>
+                <w:szCs w:val="21"/>
               </w:rPr>
               <w:t>EUR 79,00</w:t>
             </w:r>
@@ -10308,8 +10365,8 @@
                 <w:rFonts w:ascii="Times New Roman" w:hAnsi="Times New Roman" w:eastAsia="Times New Roman" w:cs="Times New Roman"/>
                 <w:b w:val="0"/>
                 <w:bCs w:val="0"/>
-                <w:sz w:val="18"/>
-                <w:szCs w:val="18"/>
+                <w:sz w:val="21"/>
+                <w:szCs w:val="21"/>
               </w:rPr>
               <w:t>Standard + Vollständigkeitserklärungs-Koordination + persönlicher Ansprechpartner + 24h-Reaktionszeit / 标准+完整性声明协调+专属客户经理+24小时响应时间</w:t>
             </w:r>
@@ -10772,8 +10829,8 @@
         <w:rPr>
           <w:rFonts w:ascii="Times New Roman" w:hAnsi="Times New Roman" w:eastAsia="Times New Roman" w:cs="Times New Roman"/>
           <w:b/>
-          <w:sz w:val="28"/>
-          <w:szCs w:val="28"/>
+          <w:sz w:val="30"/>
+          <w:szCs w:val="30"/>
         </w:rPr>
         <w:t>Unterzeichnung / 签署</w:t>
       </w:r>

</xml_diff>

<commit_message>
docs(epr): 合同正文 §35(2) VerpackG 全量清扫为 §5 VerpackDG
- 前言(德/中)、§3(1)(德/中)、§3(8)(德/中) 共 6 处 §35(2) VerpackG → §5 VerpackDG
- 本地 docxtemplater 渲染验证通过，18 占位符完好、无残留 §35

来源：ZSVR《Informationen für Bevollmächtigte》(§5 Abs 2 S 2 / §5 Abs 4 S 1 VerpackDG)

Co-Authored-By: Claude <noreply@anthropic.com>
</commit_message>
<xml_diff>
--- a/projects/contracts/LIVANTO/包装法_授权代表合同.docx
+++ b/projects/contracts/LIVANTO/包装法_授权代表合同.docx
@@ -134,7 +134,7 @@
                 <w:sz w:val="21"/>
                 <w:szCs w:val="21"/>
               </w:rPr>
-              <w:t>Dieser Bevollmächtigungsvertrag ist ein Geschäftsbesorgungsvertrag gemäß § 675 BGB zur Bestellung eines Bevollmächtigten nach § 35 Absatz 2 VerpackG. Der Bevollmächtigte handelt im eigenen Namen und gilt als „Quasi-Hersteller" im Sinne des Verpackungsgesetzes, ohne selbst Verpackungen in Verkehr zu bringen.</w:t>
+              <w:t>Dieser Bevollmächtigungsvertrag ist ein Geschäftsbesorgungsvertrag gemäß § 675 BGB zur Bestellung eines Bevollmächtigten nach § 5 VerpackDG. Der Bevollmächtigte handelt im eigenen Namen und gilt als „Quasi-Hersteller" im Sinne des Verpackungsgesetzes, ohne selbst Verpackungen in Verkehr zu bringen.</w:t>
             </w:r>
           </w:p>
         </w:tc>
@@ -166,7 +166,7 @@
                 <w:sz w:val="21"/>
                 <w:szCs w:val="21"/>
               </w:rPr>
-              <w:t>本合同为依据《德国民法典》(BGB)第675条之事务处理合同，旨在根据《德国包装法》(VerpackG)第35条第2款指定授权代表。授权代表以其自身名义行事，在《包装法》意义上被视为"准生产商"，但其自身并不投放包装。</w:t>
+              <w:t>本合同为依据《德国民法典》(BGB)第675条之事务处理合同，旨在根据《德国包装法实施法》(VerpackDG)第5条指定授权代表。授权代表以其自身名义行事，在《包装法》意义上被视为"准生产商"，但其自身并不投放包装。</w:t>
             </w:r>
           </w:p>
         </w:tc>
@@ -1803,7 +1803,7 @@
                 <w:sz w:val="21"/>
                 <w:szCs w:val="21"/>
               </w:rPr>
-              <w:t>(1) Der Kunde bestellt hiermit unwiderruflich die LIVANTO GmbH zu seinem Bevollmächtigten gemäß § 35 Absatz 2 VerpackG. Der Bevollmächtigte übernimmt sämtliche Pflichten des Kunden als Hersteller nach dem Verpackungsgesetz — mit alleiniger Ausnahme der Registrierungspflicht nach § 6 VerpackDG, die beim Kunden verbleibt. Eine Beschränkung auf einzelne Pflichten ist ausgeschlossen („Ganz-oder-Gar-Nicht-Lösung").</w:t>
+              <w:t>(1) Der Kunde bestellt hiermit unwiderruflich die LIVANTO GmbH zu seinem Bevollmächtigten gemäß § 5 VerpackDG. Der Bevollmächtigte übernimmt sämtliche Pflichten des Kunden als Hersteller nach dem Verpackungsgesetz — mit alleiniger Ausnahme der Registrierungspflicht nach § 6 VerpackDG, die beim Kunden verbleibt. Eine Beschränkung auf einzelne Pflichten ist ausgeschlossen („Ganz-oder-Gar-Nicht-Lösung").</w:t>
             </w:r>
           </w:p>
         </w:tc>
@@ -1835,7 +1835,7 @@
                 <w:sz w:val="21"/>
                 <w:szCs w:val="21"/>
               </w:rPr>
-              <w:t>(1) 客户在此不可撤销地指定LIVANTO有限责任公司为其依据《包装法》第35条第2款的授权代表。授权代表承担客户作为生产商在《包装法》下的全部义务——唯一例外为第6条规定的注册义务（由客户自行履行）。禁止将授权限制于部分义务（"全有或全无原则"）。</w:t>
+              <w:t>(1) 客户在此不可撤销地指定LIVANTO有限责任公司为其依据《包装法实施法》(VerpackDG)第5条的授权代表。授权代表承担客户作为生产商在《包装法》下的全部义务——唯一例外为第6条规定的注册义务（由客户自行履行）。禁止将授权限制于部分义务（"全有或全无原则"）。</w:t>
             </w:r>
           </w:p>
         </w:tc>
@@ -3632,7 +3632,7 @@
                 <w:sz w:val="21"/>
                 <w:szCs w:val="21"/>
               </w:rPr>
-              <w:t>(8) Der Kunde versichert, (a) dass er gemäß § 35 Absatz 2 VerpackG/VerpackDG nur einen einzigen Bevollmächtigten mit der Wahrnehmung seiner verpackungsrechtlichen Pflichten beauftragt hat und während der Laufzeit dieses Vertrages keinen weiteren Bevollmächtigten beauftragen wird, (b) dass er über keine Niederlassung im Geltungsbereich des VerpackG/VerpackDG verfügt, und (c) dass dieser Vertrag von einer zur Vertretung des Kunden berechtigten Person unterzeichnet wird. Eine Aufteilung der verpackungsrechtlichen Pflichten auf mehrere Bevollmächtigte ist unzulässig.</w:t>
+              <w:t>(8) Der Kunde versichert, (a) dass er gemäß § 5 VerpackDG nur einen einzigen Bevollmächtigten mit der Wahrnehmung seiner verpackungsrechtlichen Pflichten beauftragt hat und während der Laufzeit dieses Vertrages keinen weiteren Bevollmächtigten beauftragen wird, (b) dass er über keine Niederlassung im Geltungsbereich des VerpackG/VerpackDG verfügt, und (c) dass dieser Vertrag von einer zur Vertretung des Kunden berechtigten Person unterzeichnet wird. Eine Aufteilung der verpackungsrechtlichen Pflichten auf mehrere Bevollmächtigte ist unzulässig.</w:t>
             </w:r>
           </w:p>
         </w:tc>
@@ -3664,7 +3664,7 @@
                 <w:sz w:val="21"/>
                 <w:szCs w:val="21"/>
               </w:rPr>
-              <w:t>(8) 客户保证：(a) 依据《包装法》/《包装法实施法》第35条第2款，其仅指定一名授权代表处理其包装法义务，且在合同期内不会另行指定其他授权代表；(b) 其在《包装法》/《包装法实施法》适用范围内不设有经营机构；(c) 本合同由其有权代表客户的人员签署。将包装法义务拆分给多名授权代表是不被允许的。</w:t>
+              <w:t>(8) 客户保证：(a) 依据《包装法实施法》(VerpackDG)第5条，其仅指定一名授权代表处理其包装法义务，且在合同期内不会另行指定其他授权代表；(b) 其在《包装法》/《包装法实施法》适用范围内不设有经营机构；(c) 本合同由其有权代表客户的人员签署。将包装法义务拆分给多名授权代表是不被允许的。</w:t>
             </w:r>
           </w:p>
         </w:tc>

</xml_diff>